<commit_message>
fix: capture_verify_ui.py now uses PrintWindow for DPI-safe widget captures; clean up debug artifacts; move verify PNGs to verify_shots/
</commit_message>
<xml_diff>
--- a/差异.docx
+++ b/差异.docx
@@ -232,9 +232,6 @@
       <w:pPr>
         <w:pStyle w:val="a7"/>
         <w:ind w:left="360" w:firstLineChars="0" w:firstLine="0"/>
-        <w:rPr>
-          <w:rFonts w:hint="eastAsia"/>
-        </w:rPr>
       </w:pPr>
       <w:r>
         <w:rPr>
@@ -439,7 +436,6 @@
         <w:pStyle w:val="a7"/>
         <w:ind w:left="360" w:firstLineChars="0" w:firstLine="0"/>
         <w:rPr>
-          <w:rFonts w:hint="eastAsia"/>
           <w:color w:val="FF0000"/>
         </w:rPr>
       </w:pPr>
@@ -569,7 +565,6 @@
         <w:pStyle w:val="a7"/>
         <w:ind w:left="360" w:firstLineChars="0" w:firstLine="0"/>
         <w:rPr>
-          <w:rFonts w:hint="eastAsia"/>
           <w:color w:val="FF0000"/>
         </w:rPr>
       </w:pPr>
@@ -619,7 +614,6 @@
         <w:pStyle w:val="a7"/>
         <w:ind w:left="360" w:firstLineChars="0" w:firstLine="0"/>
         <w:rPr>
-          <w:rFonts w:hint="eastAsia"/>
           <w:color w:val="FF0000"/>
         </w:rPr>
       </w:pPr>
@@ -738,11 +732,6 @@
       </w:r>
     </w:p>
     <w:p>
-      <w:pPr>
-        <w:rPr>
-          <w:rFonts w:hint="eastAsia"/>
-        </w:rPr>
-      </w:pPr>
       <w:r>
         <w:rPr>
           <w:noProof/>
@@ -784,8 +773,133 @@
           </wp:inline>
         </w:drawing>
       </w:r>
+    </w:p>
+    <w:p/>
+    <w:p>
+      <w:r>
+        <w:rPr>
+          <w:rFonts w:hint="eastAsia"/>
+        </w:rPr>
+        <w:t>目前程序调整后检查结果是这样的</w:t>
+      </w:r>
+    </w:p>
+    <w:p>
+      <w:pPr>
+        <w:rPr>
+          <w:rFonts w:hint="eastAsia"/>
+        </w:rPr>
+      </w:pPr>
+      <w:r>
+        <w:rPr>
+          <w:noProof/>
+        </w:rPr>
+        <w:drawing>
+          <wp:inline distT="0" distB="0" distL="0" distR="0" wp14:anchorId="1954BA92" wp14:editId="7CD7CB37">
+            <wp:extent cx="5274310" cy="2947035"/>
+            <wp:effectExtent l="0" t="0" r="2540" b="5715"/>
+            <wp:docPr id="7" name="图片 7"/>
+            <wp:cNvGraphicFramePr>
+              <a:graphicFrameLocks xmlns:a="http://schemas.openxmlformats.org/drawingml/2006/main" noChangeAspect="1"/>
+            </wp:cNvGraphicFramePr>
+            <a:graphic xmlns:a="http://schemas.openxmlformats.org/drawingml/2006/main">
+              <a:graphicData uri="http://schemas.openxmlformats.org/drawingml/2006/picture">
+                <pic:pic xmlns:pic="http://schemas.openxmlformats.org/drawingml/2006/picture">
+                  <pic:nvPicPr>
+                    <pic:cNvPr id="1" name=""/>
+                    <pic:cNvPicPr/>
+                  </pic:nvPicPr>
+                  <pic:blipFill>
+                    <a:blip r:embed="rId17"/>
+                    <a:stretch>
+                      <a:fillRect/>
+                    </a:stretch>
+                  </pic:blipFill>
+                  <pic:spPr>
+                    <a:xfrm>
+                      <a:off x="0" y="0"/>
+                      <a:ext cx="5274310" cy="2947035"/>
+                    </a:xfrm>
+                    <a:prstGeom prst="rect">
+                      <a:avLst/>
+                    </a:prstGeom>
+                  </pic:spPr>
+                </pic:pic>
+              </a:graphicData>
+            </a:graphic>
+          </wp:inline>
+        </w:drawing>
+      </w:r>
+    </w:p>
+    <w:p/>
+    <w:p>
+      <w:r>
+        <w:rPr>
+          <w:rFonts w:hint="eastAsia"/>
+        </w:rPr>
+        <w:t>要调整</w:t>
+      </w:r>
+      <w:r>
+        <w:rPr>
+          <w:rFonts w:hint="eastAsia"/>
+        </w:rPr>
+        <w:t>成</w:t>
+      </w:r>
+      <w:r>
+        <w:rPr>
+          <w:rFonts w:hint="eastAsia"/>
+        </w:rPr>
+        <w:t>下图</w:t>
+      </w:r>
+      <w:r>
+        <w:rPr>
+          <w:rFonts w:hint="eastAsia"/>
+        </w:rPr>
+        <w:t>这样。</w:t>
+      </w:r>
       <w:bookmarkStart w:id="0" w:name="_GoBack"/>
       <w:bookmarkEnd w:id="0"/>
+    </w:p>
+    <w:p>
+      <w:r>
+        <w:rPr>
+          <w:noProof/>
+        </w:rPr>
+        <w:drawing>
+          <wp:inline distT="0" distB="0" distL="0" distR="0" wp14:anchorId="4386AD99" wp14:editId="33B64694">
+            <wp:extent cx="5274310" cy="1970405"/>
+            <wp:effectExtent l="0" t="0" r="2540" b="0"/>
+            <wp:docPr id="6" name="图片 6"/>
+            <wp:cNvGraphicFramePr>
+              <a:graphicFrameLocks xmlns:a="http://schemas.openxmlformats.org/drawingml/2006/main" noChangeAspect="1"/>
+            </wp:cNvGraphicFramePr>
+            <a:graphic xmlns:a="http://schemas.openxmlformats.org/drawingml/2006/main">
+              <a:graphicData uri="http://schemas.openxmlformats.org/drawingml/2006/picture">
+                <pic:pic xmlns:pic="http://schemas.openxmlformats.org/drawingml/2006/picture">
+                  <pic:nvPicPr>
+                    <pic:cNvPr id="1" name=""/>
+                    <pic:cNvPicPr/>
+                  </pic:nvPicPr>
+                  <pic:blipFill>
+                    <a:blip r:embed="rId18"/>
+                    <a:stretch>
+                      <a:fillRect/>
+                    </a:stretch>
+                  </pic:blipFill>
+                  <pic:spPr>
+                    <a:xfrm>
+                      <a:off x="0" y="0"/>
+                      <a:ext cx="5274310" cy="1970405"/>
+                    </a:xfrm>
+                    <a:prstGeom prst="rect">
+                      <a:avLst/>
+                    </a:prstGeom>
+                  </pic:spPr>
+                </pic:pic>
+              </a:graphicData>
+            </a:graphic>
+          </wp:inline>
+        </w:drawing>
+      </w:r>
     </w:p>
     <w:sectPr>
       <w:pgSz w:w="11906" w:h="16838"/>

</xml_diff>